<commit_message>
docs: sync all docs and reports with actual codebase
</commit_message>
<xml_diff>
--- a/docs/API_GUIDE_FRONTEND.docx
+++ b/docs/API_GUIDE_FRONTEND.docx
@@ -230,270 +230,163 @@
         <w:spacing w:after="80" w:before="160"/>
       </w:pPr>
       <w:r>
-        <w:rPr>
-          <w:rFonts w:ascii="Arial" w:cs="Arial" w:eastAsia="Arial" w:hAnsi="Arial"/>
-          <w:b/>
-          <w:bCs/>
-          <w:sz w:val="20"/>
-          <w:szCs w:val="20"/>
-        </w:rPr>
-        <w:t xml:space="preserve">Cấu hình Axios (TypeScript):</w:t>
-      </w:r>
-    </w:p>
-    <w:p>
-      <w:pPr>
-        <w:shd w:fill="F3F4F6" w:color="auto" w:val="clear"/>
-        <w:spacing w:after="0" w:before="0"/>
-        <w:ind w:left="360"/>
-      </w:pPr>
-      <w:r>
-        <w:rPr>
-          <w:rFonts w:ascii="Courier New" w:cs="Courier New" w:eastAsia="Courier New" w:hAnsi="Courier New"/>
-          <w:color w:val="1F2937"/>
-          <w:sz w:val="18"/>
-          <w:szCs w:val="18"/>
-        </w:rPr>
-        <w:t xml:space="preserve">// src/lib/api.ts</w:t>
-      </w:r>
-    </w:p>
-    <w:p>
-      <w:pPr>
-        <w:shd w:fill="F3F4F6" w:color="auto" w:val="clear"/>
-        <w:spacing w:after="0" w:before="0"/>
-        <w:ind w:left="360"/>
-      </w:pPr>
-      <w:r>
-        <w:rPr>
-          <w:rFonts w:ascii="Courier New" w:cs="Courier New" w:eastAsia="Courier New" w:hAnsi="Courier New"/>
-          <w:color w:val="1F2937"/>
-          <w:sz w:val="18"/>
-          <w:szCs w:val="18"/>
-        </w:rPr>
-        <w:t xml:space="preserve">import axios from 'axios';</w:t>
-      </w:r>
-    </w:p>
-    <w:p>
-      <w:pPr>
-        <w:shd w:fill="F3F4F6" w:color="auto" w:val="clear"/>
-        <w:spacing w:after="0" w:before="0"/>
-        <w:ind w:left="360"/>
-      </w:pPr>
-      <w:r>
-        <w:rPr>
-          <w:rFonts w:ascii="Courier New" w:cs="Courier New" w:eastAsia="Courier New" w:hAnsi="Courier New"/>
-          <w:color w:val="1F2937"/>
-          <w:sz w:val="18"/>
-          <w:szCs w:val="18"/>
-        </w:rPr>
-        <w:t xml:space="preserve"/>
-      </w:r>
-    </w:p>
-    <w:p>
-      <w:pPr>
-        <w:shd w:fill="F3F4F6" w:color="auto" w:val="clear"/>
-        <w:spacing w:after="0" w:before="0"/>
-        <w:ind w:left="360"/>
-      </w:pPr>
-      <w:r>
-        <w:rPr>
-          <w:rFonts w:ascii="Courier New" w:cs="Courier New" w:eastAsia="Courier New" w:hAnsi="Courier New"/>
-          <w:color w:val="1F2937"/>
-          <w:sz w:val="18"/>
-          <w:szCs w:val="18"/>
-        </w:rPr>
-        <w:t xml:space="preserve">const api = axios.create({</w:t>
-      </w:r>
-    </w:p>
-    <w:p>
-      <w:pPr>
-        <w:shd w:fill="F3F4F6" w:color="auto" w:val="clear"/>
-        <w:spacing w:after="0" w:before="0"/>
-        <w:ind w:left="360"/>
-      </w:pPr>
-      <w:r>
-        <w:rPr>
-          <w:rFonts w:ascii="Courier New" w:cs="Courier New" w:eastAsia="Courier New" w:hAnsi="Courier New"/>
-          <w:color w:val="1F2937"/>
-          <w:sz w:val="18"/>
-          <w:szCs w:val="18"/>
-        </w:rPr>
-        <w:t xml:space="preserve">  baseURL: import.meta.env.VITE_API_BASE_URL,</w:t>
-      </w:r>
-    </w:p>
-    <w:p>
-      <w:pPr>
-        <w:shd w:fill="F3F4F6" w:color="auto" w:val="clear"/>
-        <w:spacing w:after="0" w:before="0"/>
-        <w:ind w:left="360"/>
-      </w:pPr>
-      <w:r>
-        <w:rPr>
-          <w:rFonts w:ascii="Courier New" w:cs="Courier New" w:eastAsia="Courier New" w:hAnsi="Courier New"/>
-          <w:color w:val="1F2937"/>
-          <w:sz w:val="18"/>
-          <w:szCs w:val="18"/>
-        </w:rPr>
-        <w:t xml:space="preserve">  headers: { 'Content-Type': 'application/json' },</w:t>
-      </w:r>
-    </w:p>
-    <w:p>
-      <w:pPr>
-        <w:shd w:fill="F3F4F6" w:color="auto" w:val="clear"/>
-        <w:spacing w:after="0" w:before="0"/>
-        <w:ind w:left="360"/>
-      </w:pPr>
-      <w:r>
-        <w:rPr>
-          <w:rFonts w:ascii="Courier New" w:cs="Courier New" w:eastAsia="Courier New" w:hAnsi="Courier New"/>
-          <w:color w:val="1F2937"/>
-          <w:sz w:val="18"/>
-          <w:szCs w:val="18"/>
-        </w:rPr>
-        <w:t xml:space="preserve">});</w:t>
-      </w:r>
-    </w:p>
-    <w:p>
-      <w:pPr>
-        <w:shd w:fill="F3F4F6" w:color="auto" w:val="clear"/>
-        <w:spacing w:after="0" w:before="0"/>
-        <w:ind w:left="360"/>
-      </w:pPr>
-      <w:r>
-        <w:rPr>
-          <w:rFonts w:ascii="Courier New" w:cs="Courier New" w:eastAsia="Courier New" w:hAnsi="Courier New"/>
-          <w:color w:val="1F2937"/>
-          <w:sz w:val="18"/>
-          <w:szCs w:val="18"/>
-        </w:rPr>
-        <w:t xml:space="preserve"/>
-      </w:r>
-    </w:p>
-    <w:p>
-      <w:pPr>
-        <w:shd w:fill="F3F4F6" w:color="auto" w:val="clear"/>
-        <w:spacing w:after="0" w:before="0"/>
-        <w:ind w:left="360"/>
-      </w:pPr>
-      <w:r>
-        <w:rPr>
-          <w:rFonts w:ascii="Courier New" w:cs="Courier New" w:eastAsia="Courier New" w:hAnsi="Courier New"/>
-          <w:color w:val="1F2937"/>
-          <w:sz w:val="18"/>
-          <w:szCs w:val="18"/>
-        </w:rPr>
-        <w:t xml:space="preserve">// Tự động gắn token vào mọi request</w:t>
-      </w:r>
-    </w:p>
-    <w:p>
-      <w:pPr>
-        <w:shd w:fill="F3F4F6" w:color="auto" w:val="clear"/>
-        <w:spacing w:after="0" w:before="0"/>
-        <w:ind w:left="360"/>
-      </w:pPr>
-      <w:r>
-        <w:rPr>
-          <w:rFonts w:ascii="Courier New" w:cs="Courier New" w:eastAsia="Courier New" w:hAnsi="Courier New"/>
-          <w:color w:val="1F2937"/>
-          <w:sz w:val="18"/>
-          <w:szCs w:val="18"/>
-        </w:rPr>
-        <w:t xml:space="preserve">api.interceptors.request.use(config =&gt; {</w:t>
-      </w:r>
-    </w:p>
-    <w:p>
-      <w:pPr>
-        <w:shd w:fill="F3F4F6" w:color="auto" w:val="clear"/>
-        <w:spacing w:after="0" w:before="0"/>
-        <w:ind w:left="360"/>
-      </w:pPr>
-      <w:r>
-        <w:rPr>
-          <w:rFonts w:ascii="Courier New" w:cs="Courier New" w:eastAsia="Courier New" w:hAnsi="Courier New"/>
-          <w:color w:val="1F2937"/>
-          <w:sz w:val="18"/>
-          <w:szCs w:val="18"/>
-        </w:rPr>
-        <w:t xml:space="preserve">  const token = localStorage.getItem('token');</w:t>
-      </w:r>
-    </w:p>
-    <w:p>
-      <w:pPr>
-        <w:shd w:fill="F3F4F6" w:color="auto" w:val="clear"/>
-        <w:spacing w:after="0" w:before="0"/>
-        <w:ind w:left="360"/>
-      </w:pPr>
-      <w:r>
-        <w:rPr>
-          <w:rFonts w:ascii="Courier New" w:cs="Courier New" w:eastAsia="Courier New" w:hAnsi="Courier New"/>
-          <w:color w:val="1F2937"/>
-          <w:sz w:val="18"/>
-          <w:szCs w:val="18"/>
-        </w:rPr>
-        <w:t xml:space="preserve">  if (token) config.headers.Authorization = `Bearer ${token}`;</w:t>
-      </w:r>
-    </w:p>
-    <w:p>
-      <w:pPr>
-        <w:shd w:fill="F3F4F6" w:color="auto" w:val="clear"/>
-        <w:spacing w:after="0" w:before="0"/>
-        <w:ind w:left="360"/>
-      </w:pPr>
-      <w:r>
-        <w:rPr>
-          <w:rFonts w:ascii="Courier New" w:cs="Courier New" w:eastAsia="Courier New" w:hAnsi="Courier New"/>
-          <w:color w:val="1F2937"/>
-          <w:sz w:val="18"/>
-          <w:szCs w:val="18"/>
-        </w:rPr>
-        <w:t xml:space="preserve">  return config;</w:t>
-      </w:r>
-    </w:p>
-    <w:p>
-      <w:pPr>
-        <w:shd w:fill="F3F4F6" w:color="auto" w:val="clear"/>
-        <w:spacing w:after="0" w:before="0"/>
-        <w:ind w:left="360"/>
-      </w:pPr>
-      <w:r>
-        <w:rPr>
-          <w:rFonts w:ascii="Courier New" w:cs="Courier New" w:eastAsia="Courier New" w:hAnsi="Courier New"/>
-          <w:color w:val="1F2937"/>
-          <w:sz w:val="18"/>
-          <w:szCs w:val="18"/>
-        </w:rPr>
-        <w:t xml:space="preserve">});</w:t>
-      </w:r>
-    </w:p>
-    <w:p>
-      <w:pPr>
-        <w:shd w:fill="F3F4F6" w:color="auto" w:val="clear"/>
-        <w:spacing w:after="0" w:before="0"/>
-        <w:ind w:left="360"/>
-      </w:pPr>
-      <w:r>
-        <w:rPr>
-          <w:rFonts w:ascii="Courier New" w:cs="Courier New" w:eastAsia="Courier New" w:hAnsi="Courier New"/>
-          <w:color w:val="1F2937"/>
-          <w:sz w:val="18"/>
-          <w:szCs w:val="18"/>
-        </w:rPr>
-        <w:t xml:space="preserve"/>
-      </w:r>
-    </w:p>
-    <w:p>
-      <w:pPr>
-        <w:shd w:fill="F3F4F6" w:color="auto" w:val="clear"/>
-        <w:spacing w:after="0" w:before="0"/>
-        <w:ind w:left="360"/>
-      </w:pPr>
-      <w:r>
-        <w:rPr>
-          <w:rFonts w:ascii="Courier New" w:cs="Courier New" w:eastAsia="Courier New" w:hAnsi="Courier New"/>
-          <w:color w:val="1F2937"/>
-          <w:sz w:val="18"/>
-          <w:szCs w:val="18"/>
-        </w:rPr>
-        <w:t xml:space="preserve">export default api;</w:t>
+        <w:t>Cấu hình Fetch API (TypeScript):</w:t>
+      </w:r>
+    </w:p>
+    <w:p>
+      <w:pPr>
+        <w:shd w:fill="F3F4F6" w:color="auto" w:val="clear"/>
+        <w:spacing w:after="0" w:before="0"/>
+        <w:ind w:left="360"/>
+      </w:pPr>
+      <w:r>
+        <w:t>// src/api/client.ts</w:t>
+      </w:r>
+    </w:p>
+    <w:p>
+      <w:pPr>
+        <w:shd w:fill="F3F4F6" w:color="auto" w:val="clear"/>
+        <w:spacing w:after="0" w:before="0"/>
+        <w:ind w:left="360"/>
+      </w:pPr>
+      <w:r>
+        <w:t>const API_BASE = import.meta.env.VITE_API_BASE_URL ?? '/api';</w:t>
+      </w:r>
+    </w:p>
+    <w:p>
+      <w:pPr>
+        <w:shd w:fill="F3F4F6" w:color="auto" w:val="clear"/>
+        <w:spacing w:after="0" w:before="0"/>
+        <w:ind w:left="360"/>
+      </w:pPr>
+      <w:r/>
+    </w:p>
+    <w:p>
+      <w:pPr>
+        <w:shd w:fill="F3F4F6" w:color="auto" w:val="clear"/>
+        <w:spacing w:after="0" w:before="0"/>
+        <w:ind w:left="360"/>
+      </w:pPr>
+      <w:r>
+        <w:t>function getStoredToken(): string | null {</w:t>
+      </w:r>
+    </w:p>
+    <w:p>
+      <w:pPr>
+        <w:shd w:fill="F3F4F6" w:color="auto" w:val="clear"/>
+        <w:spacing w:after="0" w:before="0"/>
+        <w:ind w:left="360"/>
+      </w:pPr>
+      <w:r>
+        <w:t xml:space="preserve">  return localStorage.getItem('token') || sessionStorage.getItem('token') || null;</w:t>
+      </w:r>
+    </w:p>
+    <w:p>
+      <w:pPr>
+        <w:shd w:fill="F3F4F6" w:color="auto" w:val="clear"/>
+        <w:spacing w:after="0" w:before="0"/>
+        <w:ind w:left="360"/>
+      </w:pPr>
+      <w:r>
+        <w:t>}</w:t>
+      </w:r>
+    </w:p>
+    <w:p>
+      <w:pPr>
+        <w:shd w:fill="F3F4F6" w:color="auto" w:val="clear"/>
+        <w:spacing w:after="0" w:before="0"/>
+        <w:ind w:left="360"/>
+      </w:pPr>
+      <w:r/>
+    </w:p>
+    <w:p>
+      <w:pPr>
+        <w:shd w:fill="F3F4F6" w:color="auto" w:val="clear"/>
+        <w:spacing w:after="0" w:before="0"/>
+        <w:ind w:left="360"/>
+      </w:pPr>
+      <w:r>
+        <w:t>async function request&lt;T&gt;(path: string, options: RequestInit = {}): Promise&lt;T&gt; {</w:t>
+      </w:r>
+    </w:p>
+    <w:p>
+      <w:pPr>
+        <w:shd w:fill="F3F4F6" w:color="auto" w:val="clear"/>
+        <w:spacing w:after="0" w:before="0"/>
+        <w:ind w:left="360"/>
+      </w:pPr>
+      <w:r>
+        <w:t xml:space="preserve">  const token = getStoredToken();</w:t>
+      </w:r>
+    </w:p>
+    <w:p>
+      <w:pPr>
+        <w:shd w:fill="F3F4F6" w:color="auto" w:val="clear"/>
+        <w:spacing w:after="0" w:before="0"/>
+        <w:ind w:left="360"/>
+      </w:pPr>
+      <w:r>
+        <w:t xml:space="preserve">  const res = await fetch(API_BASE + path, {</w:t>
+      </w:r>
+    </w:p>
+    <w:p>
+      <w:pPr>
+        <w:shd w:fill="F3F4F6" w:color="auto" w:val="clear"/>
+        <w:spacing w:after="0" w:before="0"/>
+        <w:ind w:left="360"/>
+      </w:pPr>
+      <w:r>
+        <w:t xml:space="preserve">    ...options,</w:t>
+      </w:r>
+    </w:p>
+    <w:p>
+      <w:pPr>
+        <w:shd w:fill="F3F4F6" w:color="auto" w:val="clear"/>
+        <w:spacing w:after="0" w:before="0"/>
+        <w:ind w:left="360"/>
+      </w:pPr>
+      <w:r>
+        <w:t xml:space="preserve">    headers: {</w:t>
+      </w:r>
+    </w:p>
+    <w:p>
+      <w:pPr>
+        <w:shd w:fill="F3F4F6" w:color="auto" w:val="clear"/>
+        <w:spacing w:after="0" w:before="0"/>
+        <w:ind w:left="360"/>
+      </w:pPr>
+      <w:r>
+        <w:t xml:space="preserve">      'Content-Type': 'application/json',</w:t>
+      </w:r>
+    </w:p>
+    <w:p>
+      <w:pPr>
+        <w:shd w:fill="F3F4F6" w:color="auto" w:val="clear"/>
+        <w:spacing w:after="0" w:before="0"/>
+        <w:ind w:left="360"/>
+      </w:pPr>
+      <w:r>
+        <w:t xml:space="preserve">      ...(token ? { Authorization: `Bearer ${token}` } : {}),</w:t>
+      </w:r>
+    </w:p>
+    <w:p>
+      <w:pPr>
+        <w:shd w:fill="F3F4F6" w:color="auto" w:val="clear"/>
+        <w:spacing w:after="0" w:before="0"/>
+        <w:ind w:left="360"/>
+      </w:pPr>
+      <w:r>
+        <w:t xml:space="preserve">      ...options.headers,</w:t>
+      </w:r>
+    </w:p>
+    <w:p>
+      <w:pPr>
+        <w:shd w:fill="F3F4F6" w:color="auto" w:val="clear"/>
+        <w:spacing w:after="0" w:before="0"/>
+        <w:ind w:left="360"/>
+      </w:pPr>
+      <w:r>
+        <w:t xml:space="preserve">    },</w:t>
       </w:r>
     </w:p>
     <w:p>
@@ -3769,6 +3662,254 @@
           </w:p>
         </w:tc>
       </w:tr>
+      <w:tr>
+        <w:tc>
+          <w:tcPr>
+            <w:tcW w:type="dxa" w:w="1100"/>
+            <w:tcBorders>
+              <w:top w:val="single" w:color="E5E7EB" w:sz="1"/>
+              <w:left w:val="single" w:color="E5E7EB" w:sz="1"/>
+              <w:bottom w:val="single" w:color="E5E7EB" w:sz="1"/>
+              <w:right w:val="single" w:color="E5E7EB" w:sz="1"/>
+            </w:tcBorders>
+            <w:shd w:fill="FFFBEB" w:color="auto" w:val="clear"/>
+            <w:tcMar>
+              <w:top w:type="dxa" w:w="80"/>
+              <w:left w:type="dxa" w:w="120"/>
+              <w:bottom w:type="dxa" w:w="80"/>
+              <w:right w:type="dxa" w:w="120"/>
+            </w:tcMar>
+            <w:vAlign w:val="center"/>
+          </w:tcPr>
+          <w:p>
+            <w:pPr>
+              <w:jc w:val="center"/>
+            </w:pPr>
+            <w:r>
+              <w:rPr>
+                <w:rFonts w:ascii="Arial" w:cs="Arial" w:eastAsia="Arial" w:hAnsi="Arial"/>
+                <w:b/>
+                <w:bCs/>
+                <w:color w:val="B45309"/>
+                <w:sz w:val="18"/>
+                <w:szCs w:val="18"/>
+              </w:rPr>
+              <w:t xml:space="preserve">POST</w:t>
+            </w:r>
+          </w:p>
+        </w:tc>
+        <w:tc>
+          <w:tcPr>
+            <w:tcW w:type="dxa" w:w="3500"/>
+            <w:tcBorders>
+              <w:top w:val="single" w:color="E5E7EB" w:sz="1"/>
+              <w:left w:val="single" w:color="E5E7EB" w:sz="1"/>
+              <w:bottom w:val="single" w:color="E5E7EB" w:sz="1"/>
+              <w:right w:val="single" w:color="E5E7EB" w:sz="1"/>
+            </w:tcBorders>
+            <w:tcMar>
+              <w:top w:type="dxa" w:w="80"/>
+              <w:left w:type="dxa" w:w="120"/>
+              <w:bottom w:type="dxa" w:w="80"/>
+              <w:right w:type="dxa" w:w="120"/>
+            </w:tcMar>
+          </w:tcPr>
+          <w:p>
+            <w:r>
+              <w:rPr>
+                <w:rFonts w:ascii="Courier New" w:cs="Courier New" w:eastAsia="Courier New" w:hAnsi="Courier New"/>
+                <w:color w:val="1A56DB"/>
+                <w:sz w:val="18"/>
+                <w:szCs w:val="18"/>
+              </w:rPr>
+              <w:t xml:space="preserve">/admin/papers/reset-all-failed</w:t>
+            </w:r>
+          </w:p>
+        </w:tc>
+        <w:tc>
+          <w:tcPr>
+            <w:tcW w:type="dxa" w:w="3700"/>
+            <w:tcBorders>
+              <w:top w:val="single" w:color="E5E7EB" w:sz="1"/>
+              <w:left w:val="single" w:color="E5E7EB" w:sz="1"/>
+              <w:bottom w:val="single" w:color="E5E7EB" w:sz="1"/>
+              <w:right w:val="single" w:color="E5E7EB" w:sz="1"/>
+            </w:tcBorders>
+            <w:tcMar>
+              <w:top w:type="dxa" w:w="80"/>
+              <w:left w:type="dxa" w:w="120"/>
+              <w:bottom w:type="dxa" w:w="80"/>
+              <w:right w:type="dxa" w:w="120"/>
+            </w:tcMar>
+          </w:tcPr>
+          <w:p>
+            <w:r>
+              <w:rPr>
+                <w:rFonts w:ascii="Arial" w:cs="Arial" w:eastAsia="Arial" w:hAnsi="Arial"/>
+                <w:sz w:val="18"/>
+                <w:szCs w:val="18"/>
+              </w:rPr>
+              <w:t xml:space="preserve">Bulk reset tất cả FAILED papers</w:t>
+            </w:r>
+          </w:p>
+        </w:tc>
+        <w:tc>
+          <w:tcPr>
+            <w:tcW w:type="dxa" w:w="1060"/>
+            <w:tcBorders>
+              <w:top w:val="single" w:color="E5E7EB" w:sz="1"/>
+              <w:left w:val="single" w:color="E5E7EB" w:sz="1"/>
+              <w:bottom w:val="single" w:color="E5E7EB" w:sz="1"/>
+              <w:right w:val="single" w:color="E5E7EB" w:sz="1"/>
+            </w:tcBorders>
+            <w:shd w:fill="F3F4F6" w:color="auto" w:val="clear"/>
+            <w:tcMar>
+              <w:top w:type="dxa" w:w="80"/>
+              <w:left w:type="dxa" w:w="120"/>
+              <w:bottom w:type="dxa" w:w="80"/>
+              <w:right w:type="dxa" w:w="120"/>
+            </w:tcMar>
+            <w:vAlign w:val="center"/>
+          </w:tcPr>
+          <w:p>
+            <w:pPr>
+              <w:jc w:val="center"/>
+            </w:pPr>
+            <w:r>
+              <w:rPr>
+                <w:rFonts w:ascii="Arial" w:cs="Arial" w:eastAsia="Arial" w:hAnsi="Arial"/>
+                <w:sz w:val="18"/>
+                <w:szCs w:val="18"/>
+              </w:rPr>
+              <w:t xml:space="preserve">🔒 ADMIN</w:t>
+            </w:r>
+          </w:p>
+        </w:tc>
+      </w:tr>
+      <w:tr>
+        <w:tc>
+          <w:tcPr>
+            <w:tcW w:type="dxa" w:w="1100"/>
+            <w:tcBorders>
+              <w:top w:val="single" w:color="E5E7EB" w:sz="1"/>
+              <w:left w:val="single" w:color="E5E7EB" w:sz="1"/>
+              <w:bottom w:val="single" w:color="E5E7EB" w:sz="1"/>
+              <w:right w:val="single" w:color="E5E7EB" w:sz="1"/>
+            </w:tcBorders>
+            <w:shd w:fill="FFFBEB" w:color="auto" w:val="clear"/>
+            <w:tcMar>
+              <w:top w:type="dxa" w:w="80"/>
+              <w:left w:type="dxa" w:w="120"/>
+              <w:bottom w:type="dxa" w:w="80"/>
+              <w:right w:type="dxa" w:w="120"/>
+            </w:tcMar>
+            <w:vAlign w:val="center"/>
+          </w:tcPr>
+          <w:p>
+            <w:pPr>
+              <w:jc w:val="center"/>
+            </w:pPr>
+            <w:r>
+              <w:rPr>
+                <w:rFonts w:ascii="Arial" w:cs="Arial" w:eastAsia="Arial" w:hAnsi="Arial"/>
+                <w:b/>
+                <w:bCs/>
+                <w:color w:val="B45309"/>
+                <w:sz w:val="18"/>
+                <w:szCs w:val="18"/>
+              </w:rPr>
+              <w:t xml:space="preserve">POST</w:t>
+            </w:r>
+          </w:p>
+        </w:tc>
+        <w:tc>
+          <w:tcPr>
+            <w:tcW w:type="dxa" w:w="3500"/>
+            <w:tcBorders>
+              <w:top w:val="single" w:color="E5E7EB" w:sz="1"/>
+              <w:left w:val="single" w:color="E5E7EB" w:sz="1"/>
+              <w:bottom w:val="single" w:color="E5E7EB" w:sz="1"/>
+              <w:right w:val="single" w:color="E5E7EB" w:sz="1"/>
+            </w:tcBorders>
+            <w:tcMar>
+              <w:top w:type="dxa" w:w="80"/>
+              <w:left w:type="dxa" w:w="120"/>
+              <w:bottom w:type="dxa" w:w="80"/>
+              <w:right w:type="dxa" w:w="120"/>
+            </w:tcMar>
+          </w:tcPr>
+          <w:p>
+            <w:r>
+              <w:rPr>
+                <w:rFonts w:ascii="Courier New" w:cs="Courier New" w:eastAsia="Courier New" w:hAnsi="Courier New"/>
+                <w:color w:val="1A56DB"/>
+                <w:sz w:val="18"/>
+                <w:szCs w:val="18"/>
+              </w:rPr>
+              <w:t xml:space="preserve">/admin/papers/{id}/reset</w:t>
+            </w:r>
+          </w:p>
+        </w:tc>
+        <w:tc>
+          <w:tcPr>
+            <w:tcW w:type="dxa" w:w="3700"/>
+            <w:tcBorders>
+              <w:top w:val="single" w:color="E5E7EB" w:sz="1"/>
+              <w:left w:val="single" w:color="E5E7EB" w:sz="1"/>
+              <w:bottom w:val="single" w:color="E5E7EB" w:sz="1"/>
+              <w:right w:val="single" w:color="E5E7EB" w:sz="1"/>
+            </w:tcBorders>
+            <w:tcMar>
+              <w:top w:type="dxa" w:w="80"/>
+              <w:left w:type="dxa" w:w="120"/>
+              <w:bottom w:type="dxa" w:w="80"/>
+              <w:right w:type="dxa" w:w="120"/>
+            </w:tcMar>
+          </w:tcPr>
+          <w:p>
+            <w:r>
+              <w:rPr>
+                <w:rFonts w:ascii="Arial" w:cs="Arial" w:eastAsia="Arial" w:hAnsi="Arial"/>
+                <w:sz w:val="18"/>
+                <w:szCs w:val="18"/>
+              </w:rPr>
+              <w:t xml:space="preserve">Reset 1 paper FAILED, RetryScheduler pick up lại</w:t>
+            </w:r>
+          </w:p>
+        </w:tc>
+        <w:tc>
+          <w:tcPr>
+            <w:tcW w:type="dxa" w:w="1060"/>
+            <w:tcBorders>
+              <w:top w:val="single" w:color="E5E7EB" w:sz="1"/>
+              <w:left w:val="single" w:color="E5E7EB" w:sz="1"/>
+              <w:bottom w:val="single" w:color="E5E7EB" w:sz="1"/>
+              <w:right w:val="single" w:color="E5E7EB" w:sz="1"/>
+            </w:tcBorders>
+            <w:shd w:fill="F3F4F6" w:color="auto" w:val="clear"/>
+            <w:tcMar>
+              <w:top w:type="dxa" w:w="80"/>
+              <w:left w:type="dxa" w:w="120"/>
+              <w:bottom w:type="dxa" w:w="80"/>
+              <w:right w:type="dxa" w:w="120"/>
+            </w:tcMar>
+            <w:vAlign w:val="center"/>
+          </w:tcPr>
+          <w:p>
+            <w:pPr>
+              <w:jc w:val="center"/>
+            </w:pPr>
+            <w:r>
+              <w:rPr>
+                <w:rFonts w:ascii="Arial" w:cs="Arial" w:eastAsia="Arial" w:hAnsi="Arial"/>
+                <w:sz w:val="18"/>
+                <w:szCs w:val="18"/>
+              </w:rPr>
+              <w:t xml:space="preserve">🔒 ADMIN</w:t>
+            </w:r>
+          </w:p>
+        </w:tc>
+      </w:tr>
     </w:tbl>
     <w:p>
       <w:pPr>
@@ -6518,173 +6659,107 @@
         <w:spacing w:after="120" w:before="80"/>
       </w:pPr>
       <w:r>
-        <w:rPr>
-          <w:rFonts w:ascii="Arial" w:cs="Arial" w:eastAsia="Arial" w:hAnsi="Arial"/>
-          <w:color w:val="374151"/>
-          <w:sz w:val="20"/>
-          <w:szCs w:val="20"/>
-        </w:rPr>
-        <w:t xml:space="preserve">Global Axios error interceptor:</w:t>
-      </w:r>
-    </w:p>
-    <w:p>
-      <w:pPr>
-        <w:shd w:fill="F3F4F6" w:color="auto" w:val="clear"/>
-        <w:spacing w:after="0" w:before="0"/>
-        <w:ind w:left="360"/>
-      </w:pPr>
-      <w:r>
-        <w:rPr>
-          <w:rFonts w:ascii="Courier New" w:cs="Courier New" w:eastAsia="Courier New" w:hAnsi="Courier New"/>
-          <w:color w:val="1F2937"/>
-          <w:sz w:val="18"/>
-          <w:szCs w:val="18"/>
-        </w:rPr>
-        <w:t xml:space="preserve">api.interceptors.response.use(</w:t>
-      </w:r>
-    </w:p>
-    <w:p>
-      <w:pPr>
-        <w:shd w:fill="F3F4F6" w:color="auto" w:val="clear"/>
-        <w:spacing w:after="0" w:before="0"/>
-        <w:ind w:left="360"/>
-      </w:pPr>
-      <w:r>
-        <w:rPr>
-          <w:rFonts w:ascii="Courier New" w:cs="Courier New" w:eastAsia="Courier New" w:hAnsi="Courier New"/>
-          <w:color w:val="1F2937"/>
-          <w:sz w:val="18"/>
-          <w:szCs w:val="18"/>
-        </w:rPr>
-        <w:t xml:space="preserve">  res =&gt; res,</w:t>
-      </w:r>
-    </w:p>
-    <w:p>
-      <w:pPr>
-        <w:shd w:fill="F3F4F6" w:color="auto" w:val="clear"/>
-        <w:spacing w:after="0" w:before="0"/>
-        <w:ind w:left="360"/>
-      </w:pPr>
-      <w:r>
-        <w:rPr>
-          <w:rFonts w:ascii="Courier New" w:cs="Courier New" w:eastAsia="Courier New" w:hAnsi="Courier New"/>
-          <w:color w:val="1F2937"/>
-          <w:sz w:val="18"/>
-          <w:szCs w:val="18"/>
-        </w:rPr>
-        <w:t xml:space="preserve">  err =&gt; {</w:t>
-      </w:r>
-    </w:p>
-    <w:p>
-      <w:pPr>
-        <w:shd w:fill="F3F4F6" w:color="auto" w:val="clear"/>
-        <w:spacing w:after="0" w:before="0"/>
-        <w:ind w:left="360"/>
-      </w:pPr>
-      <w:r>
-        <w:rPr>
-          <w:rFonts w:ascii="Courier New" w:cs="Courier New" w:eastAsia="Courier New" w:hAnsi="Courier New"/>
-          <w:color w:val="1F2937"/>
-          <w:sz w:val="18"/>
-          <w:szCs w:val="18"/>
-        </w:rPr>
-        <w:t xml:space="preserve">    if (err.response?.status === 401) {</w:t>
-      </w:r>
-    </w:p>
-    <w:p>
-      <w:pPr>
-        <w:shd w:fill="F3F4F6" w:color="auto" w:val="clear"/>
-        <w:spacing w:after="0" w:before="0"/>
-        <w:ind w:left="360"/>
-      </w:pPr>
-      <w:r>
-        <w:rPr>
-          <w:rFonts w:ascii="Courier New" w:cs="Courier New" w:eastAsia="Courier New" w:hAnsi="Courier New"/>
-          <w:color w:val="1F2937"/>
-          <w:sz w:val="18"/>
-          <w:szCs w:val="18"/>
-        </w:rPr>
-        <w:t xml:space="preserve">      localStorage.removeItem('token');</w:t>
-      </w:r>
-    </w:p>
-    <w:p>
-      <w:pPr>
-        <w:shd w:fill="F3F4F6" w:color="auto" w:val="clear"/>
-        <w:spacing w:after="0" w:before="0"/>
-        <w:ind w:left="360"/>
-      </w:pPr>
-      <w:r>
-        <w:rPr>
-          <w:rFonts w:ascii="Courier New" w:cs="Courier New" w:eastAsia="Courier New" w:hAnsi="Courier New"/>
-          <w:color w:val="1F2937"/>
-          <w:sz w:val="18"/>
-          <w:szCs w:val="18"/>
-        </w:rPr>
-        <w:t xml:space="preserve">      window.location.href = '/login';</w:t>
-      </w:r>
-    </w:p>
-    <w:p>
-      <w:pPr>
-        <w:shd w:fill="F3F4F6" w:color="auto" w:val="clear"/>
-        <w:spacing w:after="0" w:before="0"/>
-        <w:ind w:left="360"/>
-      </w:pPr>
-      <w:r>
-        <w:rPr>
-          <w:rFonts w:ascii="Courier New" w:cs="Courier New" w:eastAsia="Courier New" w:hAnsi="Courier New"/>
-          <w:color w:val="1F2937"/>
-          <w:sz w:val="18"/>
-          <w:szCs w:val="18"/>
-        </w:rPr>
-        <w:t xml:space="preserve">    }</w:t>
-      </w:r>
-    </w:p>
-    <w:p>
-      <w:pPr>
-        <w:shd w:fill="F3F4F6" w:color="auto" w:val="clear"/>
-        <w:spacing w:after="0" w:before="0"/>
-        <w:ind w:left="360"/>
-      </w:pPr>
-      <w:r>
-        <w:rPr>
-          <w:rFonts w:ascii="Courier New" w:cs="Courier New" w:eastAsia="Courier New" w:hAnsi="Courier New"/>
-          <w:color w:val="1F2937"/>
-          <w:sz w:val="18"/>
-          <w:szCs w:val="18"/>
-        </w:rPr>
-        <w:t xml:space="preserve">    return Promise.reject(err);</w:t>
-      </w:r>
-    </w:p>
-    <w:p>
-      <w:pPr>
-        <w:shd w:fill="F3F4F6" w:color="auto" w:val="clear"/>
-        <w:spacing w:after="0" w:before="0"/>
-        <w:ind w:left="360"/>
-      </w:pPr>
-      <w:r>
-        <w:rPr>
-          <w:rFonts w:ascii="Courier New" w:cs="Courier New" w:eastAsia="Courier New" w:hAnsi="Courier New"/>
-          <w:color w:val="1F2937"/>
-          <w:sz w:val="18"/>
-          <w:szCs w:val="18"/>
-        </w:rPr>
-        <w:t xml:space="preserve">  }</w:t>
-      </w:r>
-    </w:p>
-    <w:p>
-      <w:pPr>
-        <w:shd w:fill="F3F4F6" w:color="auto" w:val="clear"/>
-        <w:spacing w:after="0" w:before="0"/>
-        <w:ind w:left="360"/>
-      </w:pPr>
-      <w:r>
-        <w:rPr>
-          <w:rFonts w:ascii="Courier New" w:cs="Courier New" w:eastAsia="Courier New" w:hAnsi="Courier New"/>
-          <w:color w:val="1F2937"/>
-          <w:sz w:val="18"/>
-          <w:szCs w:val="18"/>
-        </w:rPr>
-        <w:t xml:space="preserve">);</w:t>
+        <w:t>Xử lý lỗi 401 với Fetch API:</w:t>
+      </w:r>
+    </w:p>
+    <w:p>
+      <w:pPr>
+        <w:shd w:fill="F3F4F6" w:color="auto" w:val="clear"/>
+        <w:spacing w:after="0" w:before="0"/>
+        <w:ind w:left="360"/>
+      </w:pPr>
+      <w:r>
+        <w:t>// Trong request() helper — đã xử lý sẵn:</w:t>
+      </w:r>
+    </w:p>
+    <w:p>
+      <w:pPr>
+        <w:shd w:fill="F3F4F6" w:color="auto" w:val="clear"/>
+        <w:spacing w:after="0" w:before="0"/>
+        <w:ind w:left="360"/>
+      </w:pPr>
+      <w:r>
+        <w:t>if (res.status === 401) {</w:t>
+      </w:r>
+    </w:p>
+    <w:p>
+      <w:pPr>
+        <w:shd w:fill="F3F4F6" w:color="auto" w:val="clear"/>
+        <w:spacing w:after="0" w:before="0"/>
+        <w:ind w:left="360"/>
+      </w:pPr>
+      <w:r>
+        <w:t xml:space="preserve">  clearAuth(); // xóa token khỏi storage</w:t>
+      </w:r>
+    </w:p>
+    <w:p>
+      <w:pPr>
+        <w:shd w:fill="F3F4F6" w:color="auto" w:val="clear"/>
+        <w:spacing w:after="0" w:before="0"/>
+        <w:ind w:left="360"/>
+      </w:pPr>
+      <w:r>
+        <w:t xml:space="preserve">  window.location.href = '/login';</w:t>
+      </w:r>
+    </w:p>
+    <w:p>
+      <w:pPr>
+        <w:shd w:fill="F3F4F6" w:color="auto" w:val="clear"/>
+        <w:spacing w:after="0" w:before="0"/>
+        <w:ind w:left="360"/>
+      </w:pPr>
+      <w:r>
+        <w:t xml:space="preserve">  throw new ApiError(401, 'Unauthorized');</w:t>
+      </w:r>
+    </w:p>
+    <w:p>
+      <w:pPr>
+        <w:shd w:fill="F3F4F6" w:color="auto" w:val="clear"/>
+        <w:spacing w:after="0" w:before="0"/>
+        <w:ind w:left="360"/>
+      </w:pPr>
+      <w:r>
+        <w:t>}</w:t>
+      </w:r>
+    </w:p>
+    <w:p>
+      <w:pPr>
+        <w:shd w:fill="F3F4F6" w:color="auto" w:val="clear"/>
+        <w:spacing w:after="0" w:before="0"/>
+        <w:ind w:left="360"/>
+      </w:pPr>
+      <w:r>
+        <w:t>// clearAuth() xóa token khỏi cả localStorage và sessionStorage</w:t>
+      </w:r>
+    </w:p>
+    <w:p>
+      <w:pPr>
+        <w:shd w:fill="F3F4F6" w:color="auto" w:val="clear"/>
+        <w:spacing w:after="0" w:before="0"/>
+        <w:ind w:left="360"/>
+      </w:pPr>
+      <w:r>
+        <w:t>function clearAuth() {</w:t>
+      </w:r>
+    </w:p>
+    <w:p>
+      <w:pPr>
+        <w:shd w:fill="F3F4F6" w:color="auto" w:val="clear"/>
+        <w:spacing w:after="0" w:before="0"/>
+        <w:ind w:left="360"/>
+      </w:pPr>
+      <w:r>
+        <w:t xml:space="preserve">  ['token', 'role'].forEach(k =&gt; {</w:t>
+      </w:r>
+    </w:p>
+    <w:p>
+      <w:pPr>
+        <w:shd w:fill="F3F4F6" w:color="auto" w:val="clear"/>
+        <w:spacing w:after="0" w:before="0"/>
+        <w:ind w:left="360"/>
+      </w:pPr>
+      <w:r>
+        <w:t xml:space="preserve">    localStorage.removeItem(k);</w:t>
       </w:r>
     </w:p>
     <w:p>
@@ -6695,15 +6770,7 @@
         <w:spacing w:after="160" w:before="480"/>
       </w:pPr>
       <w:r>
-        <w:rPr>
-          <w:rFonts w:ascii="Arial" w:cs="Arial" w:eastAsia="Arial" w:hAnsi="Arial"/>
-          <w:b/>
-          <w:bCs/>
-          <w:color w:val="1E429F"/>
-          <w:sz w:val="36"/>
-          <w:szCs w:val="36"/>
-        </w:rPr>
-        <w:t xml:space="preserve">6. Biến môi trường</w:t>
+        <w:t xml:space="preserve">    sessionStorage.removeItem(k);</w:t>
       </w:r>
     </w:p>
     <w:p>
@@ -6711,29 +6778,17 @@
         <w:spacing w:after="120" w:before="80"/>
       </w:pPr>
       <w:r>
-        <w:rPr>
-          <w:rFonts w:ascii="Arial" w:cs="Arial" w:eastAsia="Arial" w:hAnsi="Arial"/>
-          <w:color w:val="374151"/>
-          <w:sz w:val="20"/>
-          <w:szCs w:val="20"/>
-        </w:rPr>
-        <w:t xml:space="preserve">Tạo file .env.production trong thư mục frontend/:</w:t>
-      </w:r>
-    </w:p>
-    <w:p>
-      <w:pPr>
-        <w:shd w:fill="F3F4F6" w:color="auto" w:val="clear"/>
-        <w:spacing w:after="0" w:before="0"/>
-        <w:ind w:left="360"/>
-      </w:pPr>
-      <w:r>
-        <w:rPr>
-          <w:rFonts w:ascii="Courier New" w:cs="Courier New" w:eastAsia="Courier New" w:hAnsi="Courier New"/>
-          <w:color w:val="1F2937"/>
-          <w:sz w:val="18"/>
-          <w:szCs w:val="18"/>
-        </w:rPr>
-        <w:t xml:space="preserve">VITE_API_BASE_URL=https://scholarslateapp-production.up.railway.app/api</w:t>
+        <w:t xml:space="preserve">  });</w:t>
+      </w:r>
+    </w:p>
+    <w:p>
+      <w:pPr>
+        <w:shd w:fill="F3F4F6" w:color="auto" w:val="clear"/>
+        <w:spacing w:after="0" w:before="0"/>
+        <w:ind w:left="360"/>
+      </w:pPr>
+      <w:r>
+        <w:t>}</w:t>
       </w:r>
     </w:p>
     <w:p>

</xml_diff>